<commit_message>
docs: drop the search-index-rebuild section from the tenant guides
The rebuild is an operator concern surfaced by the page itself when it is
actually needed — explaining embedding internals to tenant users added
confusion, not capability. Removed from EN and KA tenant guides (the
superadmin guide keeps its rebuild coverage).

Co-Authored-By: Claude Fable 5 <noreply@anthropic.com>
</commit_message>
<xml_diff>
--- a/frontend/public/guides/CommuniQ-Tenant-Guide-EN.docx
+++ b/frontend/public/guides/CommuniQ-Tenant-Guide-EN.docx
@@ -764,58 +764,6 @@
           <w:szCs w:val="22"/>
         </w:rPr>
         <w:t xml:space="preserve">Search compares chunks, not whole documents. You can view a document's chunks, edit one directly (its index entry updates immediately), or delete one to remove it from every answer.</w:t>
-      </w:r>
-    </w:p>
-    <w:p>
-      <w:pPr>
-        <w:pStyle w:val="Heading2"/>
-        <w:spacing w:after="100" w:before="240"/>
-      </w:pPr>
-      <w:r>
-        <w:rPr>
-          <w:rFonts w:ascii="Calibri" w:cs="Calibri" w:eastAsia="Calibri" w:hAnsi="Calibri"/>
-          <w:b/>
-          <w:bCs/>
-          <w:color w:val="07263C"/>
-          <w:sz w:val="26"/>
-          <w:szCs w:val="26"/>
-        </w:rPr>
-        <w:t xml:space="preserve">Maintenance</w:t>
-      </w:r>
-    </w:p>
-    <w:p>
-      <w:pPr>
-        <w:spacing w:after="120"/>
-      </w:pPr>
-      <w:r>
-        <w:rPr>
-          <w:rFonts w:ascii="Calibri" w:cs="Calibri" w:eastAsia="Calibri" w:hAnsi="Calibri"/>
-          <w:b w:val="false"/>
-          <w:bCs w:val="false"/>
-          <w:sz w:val="22"/>
-          <w:szCs w:val="22"/>
-        </w:rPr>
-        <w:t xml:space="preserve"/>
-      </w:r>
-      <w:r>
-        <w:rPr>
-          <w:rFonts w:ascii="Calibri" w:cs="Calibri" w:eastAsia="Calibri" w:hAnsi="Calibri"/>
-          <w:b/>
-          <w:bCs/>
-          <w:sz w:val="22"/>
-          <w:szCs w:val="22"/>
-        </w:rPr>
-        <w:t xml:space="preserve">Rebuild the search index</w:t>
-      </w:r>
-      <w:r>
-        <w:rPr>
-          <w:rFonts w:ascii="Calibri" w:cs="Calibri" w:eastAsia="Calibri" w:hAnsi="Calibri"/>
-          <w:b w:val="false"/>
-          <w:bCs w:val="false"/>
-          <w:sz w:val="22"/>
-          <w:szCs w:val="22"/>
-        </w:rPr>
-        <w:t xml:space="preserve"> re-creates the search data for every chunk. You only need it after your operator changes the embedding configuration — the page will say so. Search keeps working during a rebuild.</w:t>
       </w:r>
     </w:p>
     <w:p>

</xml_diff>